<commit_message>
Complete verified GoEmotions experiments, reports and baseline handover
</commit_message>
<xml_diff>
--- a/reports/BAO_CAO_TIEN_DO_1.docx
+++ b/reports/BAO_CAO_TIEN_DO_1.docx
@@ -37,7 +37,7 @@
         <w:t>Ngày cập nhật:</w:t>
       </w:r>
       <w:r>
-        <w:t xml:space="preserve"> 08/10/2026 13:20 (Asia/Bangkok). Đây là bản chuẩn bị báo cáo theo hiện trạng, không xác nhận đã nộp giảng viên.</w:t>
+        <w:t xml:space="preserve"> 09/10/2026 06:58 (Asia/Bangkok). Đây là bản chuẩn bị báo cáo theo hiện trạng, không xác nhận đã nộp giảng viên.</w:t>
       </w:r>
     </w:p>
     <w:p>
@@ -1445,12 +1445,12 @@
         <w:tblLook w:val="04A0" w:firstRow="1" w:lastRow="0" w:firstColumn="1" w:lastColumn="0" w:noHBand="0" w:noVBand="1"/>
       </w:tblPr>
       <w:tblGrid>
-        <w:gridCol w:w="2504"/>
-        <w:gridCol w:w="1437"/>
-        <w:gridCol w:w="1437"/>
-        <w:gridCol w:w="1437"/>
-        <w:gridCol w:w="1437"/>
-        <w:gridCol w:w="1437"/>
+        <w:gridCol w:w="1781"/>
+        <w:gridCol w:w="1582"/>
+        <w:gridCol w:w="1582"/>
+        <w:gridCol w:w="1582"/>
+        <w:gridCol w:w="1582"/>
+        <w:gridCol w:w="1582"/>
       </w:tblGrid>
       <w:tr>
         <w:trPr>
@@ -1460,7 +1460,7 @@
         </w:trPr>
         <w:tc>
           <w:tcPr>
-            <w:tcW w:w="2504" w:type="dxa"/>
+            <w:tcW w:w="1781" w:type="dxa"/>
             <w:shd w:val="clear" w:color="auto" w:fill="E6EDF3"/>
             <w:tcMar>
               <w:top w:w="65" w:type="dxa"/>
@@ -1486,7 +1486,7 @@
         </w:tc>
         <w:tc>
           <w:tcPr>
-            <w:tcW w:w="1437" w:type="dxa"/>
+            <w:tcW w:w="1582" w:type="dxa"/>
             <w:shd w:val="clear" w:color="auto" w:fill="E6EDF3"/>
             <w:tcMar>
               <w:top w:w="65" w:type="dxa"/>
@@ -1512,7 +1512,7 @@
         </w:tc>
         <w:tc>
           <w:tcPr>
-            <w:tcW w:w="1437" w:type="dxa"/>
+            <w:tcW w:w="1582" w:type="dxa"/>
             <w:shd w:val="clear" w:color="auto" w:fill="E6EDF3"/>
             <w:tcMar>
               <w:top w:w="65" w:type="dxa"/>
@@ -1538,7 +1538,7 @@
         </w:tc>
         <w:tc>
           <w:tcPr>
-            <w:tcW w:w="1437" w:type="dxa"/>
+            <w:tcW w:w="1582" w:type="dxa"/>
             <w:shd w:val="clear" w:color="auto" w:fill="E6EDF3"/>
             <w:tcMar>
               <w:top w:w="65" w:type="dxa"/>
@@ -1564,7 +1564,7 @@
         </w:tc>
         <w:tc>
           <w:tcPr>
-            <w:tcW w:w="1437" w:type="dxa"/>
+            <w:tcW w:w="1582" w:type="dxa"/>
             <w:shd w:val="clear" w:color="auto" w:fill="E6EDF3"/>
             <w:tcMar>
               <w:top w:w="65" w:type="dxa"/>
@@ -1590,7 +1590,7 @@
         </w:tc>
         <w:tc>
           <w:tcPr>
-            <w:tcW w:w="1437" w:type="dxa"/>
+            <w:tcW w:w="1582" w:type="dxa"/>
             <w:shd w:val="clear" w:color="auto" w:fill="E6EDF3"/>
             <w:tcMar>
               <w:top w:w="65" w:type="dxa"/>
@@ -1622,7 +1622,7 @@
         </w:trPr>
         <w:tc>
           <w:tcPr>
-            <w:tcW w:w="2504" w:type="dxa"/>
+            <w:tcW w:w="1781" w:type="dxa"/>
             <w:tcMar>
               <w:top w:w="65" w:type="dxa"/>
               <w:left w:w="65" w:type="dxa"/>
@@ -1639,13 +1639,13 @@
               <w:rPr>
                 <w:sz w:val="21"/>
               </w:rPr>
-              <w:t>SMOKE/PILOT; không thay benchmark full</w:t>
-            </w:r>
-          </w:p>
-        </w:tc>
-        <w:tc>
-          <w:tcPr>
-            <w:tcW w:w="1437" w:type="dxa"/>
+              <w:t>FULL validation</w:t>
+            </w:r>
+          </w:p>
+        </w:tc>
+        <w:tc>
+          <w:tcPr>
+            <w:tcW w:w="1582" w:type="dxa"/>
             <w:tcMar>
               <w:top w:w="65" w:type="dxa"/>
               <w:left w:w="65" w:type="dxa"/>
@@ -1662,13 +1662,13 @@
               <w:rPr>
                 <w:sz w:val="21"/>
               </w:rPr>
-              <w:t>8</w:t>
-            </w:r>
-          </w:p>
-        </w:tc>
-        <w:tc>
-          <w:tcPr>
-            <w:tcW w:w="1437" w:type="dxa"/>
+              <w:t>5426</w:t>
+            </w:r>
+          </w:p>
+        </w:tc>
+        <w:tc>
+          <w:tcPr>
+            <w:tcW w:w="1582" w:type="dxa"/>
             <w:tcMar>
               <w:top w:w="65" w:type="dxa"/>
               <w:left w:w="65" w:type="dxa"/>
@@ -1691,7 +1691,7 @@
         </w:tc>
         <w:tc>
           <w:tcPr>
-            <w:tcW w:w="1437" w:type="dxa"/>
+            <w:tcW w:w="1582" w:type="dxa"/>
             <w:tcMar>
               <w:top w:w="65" w:type="dxa"/>
               <w:left w:w="65" w:type="dxa"/>
@@ -1708,13 +1708,13 @@
               <w:rPr>
                 <w:sz w:val="21"/>
               </w:rPr>
-              <w:t>0.0721</w:t>
-            </w:r>
-          </w:p>
-        </w:tc>
-        <w:tc>
-          <w:tcPr>
-            <w:tcW w:w="1437" w:type="dxa"/>
+              <w:t>0.1060</w:t>
+            </w:r>
+          </w:p>
+        </w:tc>
+        <w:tc>
+          <w:tcPr>
+            <w:tcW w:w="1582" w:type="dxa"/>
             <w:tcMar>
               <w:top w:w="65" w:type="dxa"/>
               <w:left w:w="65" w:type="dxa"/>
@@ -1731,13 +1731,13 @@
               <w:rPr>
                 <w:sz w:val="21"/>
               </w:rPr>
-              <w:t>0.0781</w:t>
-            </w:r>
-          </w:p>
-        </w:tc>
-        <w:tc>
-          <w:tcPr>
-            <w:tcW w:w="1437" w:type="dxa"/>
+              <w:t>0.1027</w:t>
+            </w:r>
+          </w:p>
+        </w:tc>
+        <w:tc>
+          <w:tcPr>
+            <w:tcW w:w="1582" w:type="dxa"/>
             <w:tcMar>
               <w:top w:w="65" w:type="dxa"/>
               <w:left w:w="65" w:type="dxa"/>
@@ -1754,7 +1754,7 @@
               <w:rPr>
                 <w:sz w:val="21"/>
               </w:rPr>
-              <w:t>0.5268</w:t>
+              <w:t>0.5307</w:t>
             </w:r>
           </w:p>
         </w:tc>
@@ -1776,7 +1776,7 @@
         <w:rPr>
           <w:rFonts w:ascii="Consolas" w:eastAsia="Consolas" w:hAnsi="Consolas" w:cs="Consolas"/>
         </w:rPr>
-        <w:t>data/processed/zero_shot/smoke/run_metadata.json</w:t>
+        <w:t>data/processed/zero_shot/full/run_metadata.json</w:t>
       </w:r>
       <w:r>
         <w:t xml:space="preserve"> và </w:t>
@@ -1797,10 +1797,10 @@
         <w:t>This text expresses {}.</w:t>
       </w:r>
       <w:r>
-        <w:t xml:space="preserve">. B </w:t>
+        <w:t xml:space="preserve">. B không cập nhật trọng số </w:t>
       </w:r>
       <w:r>
-        <w:t>không cập nhật trọng số trên GoEmotions; kết quả threshold hiệu chỉnh nếu có phải tách khỏi hàng gốc. Chưa có B full; điểm pilot này không được dùng kết luận B tốt/kém hơn A hoặc C.</w:t>
+        <w:t>trên GoEmotions; kết quả threshold hiệu chỉnh nếu có phải tách khỏi hàng gốc. Đã có số full; kiểm frozen protocol trước test.</w:t>
       </w:r>
     </w:p>
     <w:p>
@@ -1816,7 +1816,7 @@
         <w:jc w:val="both"/>
       </w:pPr>
       <w:r>
-        <w:t>Tại thời điểm cập nhật có 1/9 seed full được kiểm bằng metadata và validation metrics. Seed đã có metadata nhưng chưa hoàn thành không được tính là run full; smoke/pilot được tách khỏi bảng.</w:t>
+        <w:t>Tại thời điểm cập nhật có 9/9 seed full được kiểm bằng metadata và validation metrics. Seed đã có metadata nhưng chưa hoàn thành không được tính là run full; smoke/pilot được tách khỏi bảng.</w:t>
       </w:r>
     </w:p>
     <w:tbl>
@@ -1828,12 +1828,12 @@
         <w:tblLook w:val="04A0" w:firstRow="1" w:lastRow="0" w:firstColumn="1" w:lastColumn="0" w:noHBand="0" w:noVBand="1"/>
       </w:tblPr>
       <w:tblGrid>
-        <w:gridCol w:w="2020"/>
-        <w:gridCol w:w="1349"/>
-        <w:gridCol w:w="2272"/>
-        <w:gridCol w:w="1349"/>
-        <w:gridCol w:w="1349"/>
-        <w:gridCol w:w="1349"/>
+        <w:gridCol w:w="1991"/>
+        <w:gridCol w:w="1330"/>
+        <w:gridCol w:w="2376"/>
+        <w:gridCol w:w="1330"/>
+        <w:gridCol w:w="1330"/>
+        <w:gridCol w:w="1330"/>
       </w:tblGrid>
       <w:tr>
         <w:trPr>
@@ -1843,7 +1843,7 @@
         </w:trPr>
         <w:tc>
           <w:tcPr>
-            <w:tcW w:w="2020" w:type="dxa"/>
+            <w:tcW w:w="1991" w:type="dxa"/>
             <w:shd w:val="clear" w:color="auto" w:fill="E6EDF3"/>
             <w:tcMar>
               <w:top w:w="65" w:type="dxa"/>
@@ -1869,7 +1869,7 @@
         </w:tc>
         <w:tc>
           <w:tcPr>
-            <w:tcW w:w="1349" w:type="dxa"/>
+            <w:tcW w:w="1330" w:type="dxa"/>
             <w:shd w:val="clear" w:color="auto" w:fill="E6EDF3"/>
             <w:tcMar>
               <w:top w:w="65" w:type="dxa"/>
@@ -1895,7 +1895,7 @@
         </w:tc>
         <w:tc>
           <w:tcPr>
-            <w:tcW w:w="2272" w:type="dxa"/>
+            <w:tcW w:w="2376" w:type="dxa"/>
             <w:shd w:val="clear" w:color="auto" w:fill="E6EDF3"/>
             <w:tcMar>
               <w:top w:w="65" w:type="dxa"/>
@@ -1921,7 +1921,7 @@
         </w:tc>
         <w:tc>
           <w:tcPr>
-            <w:tcW w:w="1349" w:type="dxa"/>
+            <w:tcW w:w="1330" w:type="dxa"/>
             <w:shd w:val="clear" w:color="auto" w:fill="E6EDF3"/>
             <w:tcMar>
               <w:top w:w="65" w:type="dxa"/>
@@ -1947,7 +1947,7 @@
         </w:tc>
         <w:tc>
           <w:tcPr>
-            <w:tcW w:w="1349" w:type="dxa"/>
+            <w:tcW w:w="1330" w:type="dxa"/>
             <w:shd w:val="clear" w:color="auto" w:fill="E6EDF3"/>
             <w:tcMar>
               <w:top w:w="65" w:type="dxa"/>
@@ -1973,7 +1973,7 @@
         </w:tc>
         <w:tc>
           <w:tcPr>
-            <w:tcW w:w="1349" w:type="dxa"/>
+            <w:tcW w:w="1330" w:type="dxa"/>
             <w:shd w:val="clear" w:color="auto" w:fill="E6EDF3"/>
             <w:tcMar>
               <w:top w:w="65" w:type="dxa"/>
@@ -2005,7 +2005,7 @@
         </w:trPr>
         <w:tc>
           <w:tcPr>
-            <w:tcW w:w="2020" w:type="dxa"/>
+            <w:tcW w:w="1991" w:type="dxa"/>
             <w:tcMar>
               <w:top w:w="65" w:type="dxa"/>
               <w:left w:w="65" w:type="dxa"/>
@@ -2028,7 +2028,7 @@
         </w:tc>
         <w:tc>
           <w:tcPr>
-            <w:tcW w:w="1349" w:type="dxa"/>
+            <w:tcW w:w="1330" w:type="dxa"/>
             <w:tcMar>
               <w:top w:w="65" w:type="dxa"/>
               <w:left w:w="65" w:type="dxa"/>
@@ -2051,7 +2051,7 @@
         </w:tc>
         <w:tc>
           <w:tcPr>
-            <w:tcW w:w="2272" w:type="dxa"/>
+            <w:tcW w:w="2376" w:type="dxa"/>
             <w:tcMar>
               <w:top w:w="65" w:type="dxa"/>
               <w:left w:w="65" w:type="dxa"/>
@@ -2068,19 +2068,13 @@
               <w:rPr>
                 <w:sz w:val="21"/>
               </w:rPr>
-              <w:t xml:space="preserve">Full </w:t>
-            </w:r>
-            <w:r>
-              <w:rPr>
-                <w:sz w:val="21"/>
-              </w:rPr>
-              <w:t>validation hoàn thành</w:t>
-            </w:r>
-          </w:p>
-        </w:tc>
-        <w:tc>
-          <w:tcPr>
-            <w:tcW w:w="1349" w:type="dxa"/>
+              <w:t>Full validation hoàn thành</w:t>
+            </w:r>
+          </w:p>
+        </w:tc>
+        <w:tc>
+          <w:tcPr>
+            <w:tcW w:w="1330" w:type="dxa"/>
             <w:tcMar>
               <w:top w:w="65" w:type="dxa"/>
               <w:left w:w="65" w:type="dxa"/>
@@ -2103,7 +2097,7 @@
         </w:tc>
         <w:tc>
           <w:tcPr>
-            <w:tcW w:w="1349" w:type="dxa"/>
+            <w:tcW w:w="1330" w:type="dxa"/>
             <w:tcMar>
               <w:top w:w="65" w:type="dxa"/>
               <w:left w:w="65" w:type="dxa"/>
@@ -2126,7 +2120,7 @@
         </w:tc>
         <w:tc>
           <w:tcPr>
-            <w:tcW w:w="1349" w:type="dxa"/>
+            <w:tcW w:w="1330" w:type="dxa"/>
             <w:tcMar>
               <w:top w:w="65" w:type="dxa"/>
               <w:left w:w="65" w:type="dxa"/>
@@ -2155,7 +2149,7 @@
         </w:trPr>
         <w:tc>
           <w:tcPr>
-            <w:tcW w:w="2020" w:type="dxa"/>
+            <w:tcW w:w="1991" w:type="dxa"/>
             <w:tcMar>
               <w:top w:w="65" w:type="dxa"/>
               <w:left w:w="65" w:type="dxa"/>
@@ -2172,13 +2166,19 @@
               <w:rPr>
                 <w:sz w:val="21"/>
               </w:rPr>
-              <w:t>C1 BERT-base-cased</w:t>
-            </w:r>
-          </w:p>
-        </w:tc>
-        <w:tc>
-          <w:tcPr>
-            <w:tcW w:w="1349" w:type="dxa"/>
+              <w:t xml:space="preserve">C1 </w:t>
+            </w:r>
+            <w:r>
+              <w:rPr>
+                <w:sz w:val="21"/>
+              </w:rPr>
+              <w:t>BERT-base-cased</w:t>
+            </w:r>
+          </w:p>
+        </w:tc>
+        <w:tc>
+          <w:tcPr>
+            <w:tcW w:w="1330" w:type="dxa"/>
             <w:tcMar>
               <w:top w:w="65" w:type="dxa"/>
               <w:left w:w="65" w:type="dxa"/>
@@ -2201,7 +2201,7 @@
         </w:tc>
         <w:tc>
           <w:tcPr>
-            <w:tcW w:w="2272" w:type="dxa"/>
+            <w:tcW w:w="2376" w:type="dxa"/>
             <w:tcMar>
               <w:top w:w="65" w:type="dxa"/>
               <w:left w:w="65" w:type="dxa"/>
@@ -2218,13 +2218,13 @@
               <w:rPr>
                 <w:sz w:val="21"/>
               </w:rPr>
-              <w:t>Có metadata; chưa hoàn thành full</w:t>
-            </w:r>
-          </w:p>
-        </w:tc>
-        <w:tc>
-          <w:tcPr>
-            <w:tcW w:w="1349" w:type="dxa"/>
+              <w:t>Full validation hoàn thành</w:t>
+            </w:r>
+          </w:p>
+        </w:tc>
+        <w:tc>
+          <w:tcPr>
+            <w:tcW w:w="1330" w:type="dxa"/>
             <w:tcMar>
               <w:top w:w="65" w:type="dxa"/>
               <w:left w:w="65" w:type="dxa"/>
@@ -2241,13 +2241,13 @@
               <w:rPr>
                 <w:sz w:val="21"/>
               </w:rPr>
-              <w:t>—</w:t>
-            </w:r>
-          </w:p>
-        </w:tc>
-        <w:tc>
-          <w:tcPr>
-            <w:tcW w:w="1349" w:type="dxa"/>
+              <w:t>0.4773</w:t>
+            </w:r>
+          </w:p>
+        </w:tc>
+        <w:tc>
+          <w:tcPr>
+            <w:tcW w:w="1330" w:type="dxa"/>
             <w:tcMar>
               <w:top w:w="65" w:type="dxa"/>
               <w:left w:w="65" w:type="dxa"/>
@@ -2264,13 +2264,13 @@
               <w:rPr>
                 <w:sz w:val="21"/>
               </w:rPr>
-              <w:t>—</w:t>
-            </w:r>
-          </w:p>
-        </w:tc>
-        <w:tc>
-          <w:tcPr>
-            <w:tcW w:w="1349" w:type="dxa"/>
+              <w:t>0.5839</w:t>
+            </w:r>
+          </w:p>
+        </w:tc>
+        <w:tc>
+          <w:tcPr>
+            <w:tcW w:w="1330" w:type="dxa"/>
             <w:tcMar>
               <w:top w:w="65" w:type="dxa"/>
               <w:left w:w="65" w:type="dxa"/>
@@ -2287,7 +2287,7 @@
               <w:rPr>
                 <w:sz w:val="21"/>
               </w:rPr>
-              <w:t>—</w:t>
+              <w:t>0.0318</w:t>
             </w:r>
           </w:p>
         </w:tc>
@@ -2299,7 +2299,7 @@
         </w:trPr>
         <w:tc>
           <w:tcPr>
-            <w:tcW w:w="2020" w:type="dxa"/>
+            <w:tcW w:w="1991" w:type="dxa"/>
             <w:tcMar>
               <w:top w:w="65" w:type="dxa"/>
               <w:left w:w="65" w:type="dxa"/>
@@ -2316,14 +2316,13 @@
               <w:rPr>
                 <w:sz w:val="21"/>
               </w:rPr>
-              <w:lastRenderedPageBreak/>
               <w:t>C1 BERT-base-cased</w:t>
             </w:r>
           </w:p>
         </w:tc>
         <w:tc>
           <w:tcPr>
-            <w:tcW w:w="1349" w:type="dxa"/>
+            <w:tcW w:w="1330" w:type="dxa"/>
             <w:tcMar>
               <w:top w:w="65" w:type="dxa"/>
               <w:left w:w="65" w:type="dxa"/>
@@ -2346,7 +2345,7 @@
         </w:tc>
         <w:tc>
           <w:tcPr>
-            <w:tcW w:w="2272" w:type="dxa"/>
+            <w:tcW w:w="2376" w:type="dxa"/>
             <w:tcMar>
               <w:top w:w="65" w:type="dxa"/>
               <w:left w:w="65" w:type="dxa"/>
@@ -2363,13 +2362,13 @@
               <w:rPr>
                 <w:sz w:val="21"/>
               </w:rPr>
-              <w:t>Chưa có artifacts full</w:t>
-            </w:r>
-          </w:p>
-        </w:tc>
-        <w:tc>
-          <w:tcPr>
-            <w:tcW w:w="1349" w:type="dxa"/>
+              <w:t>Full validation hoàn thành</w:t>
+            </w:r>
+          </w:p>
+        </w:tc>
+        <w:tc>
+          <w:tcPr>
+            <w:tcW w:w="1330" w:type="dxa"/>
             <w:tcMar>
               <w:top w:w="65" w:type="dxa"/>
               <w:left w:w="65" w:type="dxa"/>
@@ -2386,13 +2385,13 @@
               <w:rPr>
                 <w:sz w:val="21"/>
               </w:rPr>
-              <w:t>—</w:t>
-            </w:r>
-          </w:p>
-        </w:tc>
-        <w:tc>
-          <w:tcPr>
-            <w:tcW w:w="1349" w:type="dxa"/>
+              <w:t>0.4723</w:t>
+            </w:r>
+          </w:p>
+        </w:tc>
+        <w:tc>
+          <w:tcPr>
+            <w:tcW w:w="1330" w:type="dxa"/>
             <w:tcMar>
               <w:top w:w="65" w:type="dxa"/>
               <w:left w:w="65" w:type="dxa"/>
@@ -2409,13 +2408,13 @@
               <w:rPr>
                 <w:sz w:val="21"/>
               </w:rPr>
-              <w:t>—</w:t>
-            </w:r>
-          </w:p>
-        </w:tc>
-        <w:tc>
-          <w:tcPr>
-            <w:tcW w:w="1349" w:type="dxa"/>
+              <w:t>0.5822</w:t>
+            </w:r>
+          </w:p>
+        </w:tc>
+        <w:tc>
+          <w:tcPr>
+            <w:tcW w:w="1330" w:type="dxa"/>
             <w:tcMar>
               <w:top w:w="65" w:type="dxa"/>
               <w:left w:w="65" w:type="dxa"/>
@@ -2432,7 +2431,7 @@
               <w:rPr>
                 <w:sz w:val="21"/>
               </w:rPr>
-              <w:t>—</w:t>
+              <w:t>0.0321</w:t>
             </w:r>
           </w:p>
         </w:tc>
@@ -2444,7 +2443,7 @@
         </w:trPr>
         <w:tc>
           <w:tcPr>
-            <w:tcW w:w="2020" w:type="dxa"/>
+            <w:tcW w:w="1991" w:type="dxa"/>
             <w:tcMar>
               <w:top w:w="65" w:type="dxa"/>
               <w:left w:w="65" w:type="dxa"/>
@@ -2461,13 +2460,14 @@
               <w:rPr>
                 <w:sz w:val="21"/>
               </w:rPr>
+              <w:lastRenderedPageBreak/>
               <w:t>C2 RoBERTa-base</w:t>
             </w:r>
           </w:p>
         </w:tc>
         <w:tc>
           <w:tcPr>
-            <w:tcW w:w="1349" w:type="dxa"/>
+            <w:tcW w:w="1330" w:type="dxa"/>
             <w:tcMar>
               <w:top w:w="65" w:type="dxa"/>
               <w:left w:w="65" w:type="dxa"/>
@@ -2490,7 +2490,7 @@
         </w:tc>
         <w:tc>
           <w:tcPr>
-            <w:tcW w:w="2272" w:type="dxa"/>
+            <w:tcW w:w="2376" w:type="dxa"/>
             <w:tcMar>
               <w:top w:w="65" w:type="dxa"/>
               <w:left w:w="65" w:type="dxa"/>
@@ -2507,13 +2507,13 @@
               <w:rPr>
                 <w:sz w:val="21"/>
               </w:rPr>
-              <w:t>Chưa có artifacts full</w:t>
-            </w:r>
-          </w:p>
-        </w:tc>
-        <w:tc>
-          <w:tcPr>
-            <w:tcW w:w="1349" w:type="dxa"/>
+              <w:t>Full validation hoàn thành</w:t>
+            </w:r>
+          </w:p>
+        </w:tc>
+        <w:tc>
+          <w:tcPr>
+            <w:tcW w:w="1330" w:type="dxa"/>
             <w:tcMar>
               <w:top w:w="65" w:type="dxa"/>
               <w:left w:w="65" w:type="dxa"/>
@@ -2530,13 +2530,13 @@
               <w:rPr>
                 <w:sz w:val="21"/>
               </w:rPr>
-              <w:t>—</w:t>
-            </w:r>
-          </w:p>
-        </w:tc>
-        <w:tc>
-          <w:tcPr>
-            <w:tcW w:w="1349" w:type="dxa"/>
+              <w:t>0.4286</w:t>
+            </w:r>
+          </w:p>
+        </w:tc>
+        <w:tc>
+          <w:tcPr>
+            <w:tcW w:w="1330" w:type="dxa"/>
             <w:tcMar>
               <w:top w:w="65" w:type="dxa"/>
               <w:left w:w="65" w:type="dxa"/>
@@ -2553,13 +2553,13 @@
               <w:rPr>
                 <w:sz w:val="21"/>
               </w:rPr>
-              <w:t>—</w:t>
-            </w:r>
-          </w:p>
-        </w:tc>
-        <w:tc>
-          <w:tcPr>
-            <w:tcW w:w="1349" w:type="dxa"/>
+              <w:t>0.5780</w:t>
+            </w:r>
+          </w:p>
+        </w:tc>
+        <w:tc>
+          <w:tcPr>
+            <w:tcW w:w="1330" w:type="dxa"/>
             <w:tcMar>
               <w:top w:w="65" w:type="dxa"/>
               <w:left w:w="65" w:type="dxa"/>
@@ -2576,7 +2576,7 @@
               <w:rPr>
                 <w:sz w:val="21"/>
               </w:rPr>
-              <w:t>—</w:t>
+              <w:t>0.0300</w:t>
             </w:r>
           </w:p>
         </w:tc>
@@ -2588,7 +2588,7 @@
         </w:trPr>
         <w:tc>
           <w:tcPr>
-            <w:tcW w:w="2020" w:type="dxa"/>
+            <w:tcW w:w="1991" w:type="dxa"/>
             <w:tcMar>
               <w:top w:w="65" w:type="dxa"/>
               <w:left w:w="65" w:type="dxa"/>
@@ -2611,7 +2611,7 @@
         </w:tc>
         <w:tc>
           <w:tcPr>
-            <w:tcW w:w="1349" w:type="dxa"/>
+            <w:tcW w:w="1330" w:type="dxa"/>
             <w:tcMar>
               <w:top w:w="65" w:type="dxa"/>
               <w:left w:w="65" w:type="dxa"/>
@@ -2634,7 +2634,7 @@
         </w:tc>
         <w:tc>
           <w:tcPr>
-            <w:tcW w:w="2272" w:type="dxa"/>
+            <w:tcW w:w="2376" w:type="dxa"/>
             <w:tcMar>
               <w:top w:w="65" w:type="dxa"/>
               <w:left w:w="65" w:type="dxa"/>
@@ -2651,19 +2651,19 @@
               <w:rPr>
                 <w:sz w:val="21"/>
               </w:rPr>
-              <w:t xml:space="preserve">Chưa có </w:t>
+              <w:t xml:space="preserve">Full validation hoàn </w:t>
             </w:r>
             <w:r>
               <w:rPr>
                 <w:sz w:val="21"/>
               </w:rPr>
-              <w:t>artifacts full</w:t>
-            </w:r>
-          </w:p>
-        </w:tc>
-        <w:tc>
-          <w:tcPr>
-            <w:tcW w:w="1349" w:type="dxa"/>
+              <w:t>thành</w:t>
+            </w:r>
+          </w:p>
+        </w:tc>
+        <w:tc>
+          <w:tcPr>
+            <w:tcW w:w="1330" w:type="dxa"/>
             <w:tcMar>
               <w:top w:w="65" w:type="dxa"/>
               <w:left w:w="65" w:type="dxa"/>
@@ -2680,13 +2680,13 @@
               <w:rPr>
                 <w:sz w:val="21"/>
               </w:rPr>
-              <w:t>—</w:t>
-            </w:r>
-          </w:p>
-        </w:tc>
-        <w:tc>
-          <w:tcPr>
-            <w:tcW w:w="1349" w:type="dxa"/>
+              <w:t>0.4111</w:t>
+            </w:r>
+          </w:p>
+        </w:tc>
+        <w:tc>
+          <w:tcPr>
+            <w:tcW w:w="1330" w:type="dxa"/>
             <w:tcMar>
               <w:top w:w="65" w:type="dxa"/>
               <w:left w:w="65" w:type="dxa"/>
@@ -2703,13 +2703,13 @@
               <w:rPr>
                 <w:sz w:val="21"/>
               </w:rPr>
-              <w:t>—</w:t>
-            </w:r>
-          </w:p>
-        </w:tc>
-        <w:tc>
-          <w:tcPr>
-            <w:tcW w:w="1349" w:type="dxa"/>
+              <w:t>0.5730</w:t>
+            </w:r>
+          </w:p>
+        </w:tc>
+        <w:tc>
+          <w:tcPr>
+            <w:tcW w:w="1330" w:type="dxa"/>
             <w:tcMar>
               <w:top w:w="65" w:type="dxa"/>
               <w:left w:w="65" w:type="dxa"/>
@@ -2726,7 +2726,7 @@
               <w:rPr>
                 <w:sz w:val="21"/>
               </w:rPr>
-              <w:t>—</w:t>
+              <w:t>0.0300</w:t>
             </w:r>
           </w:p>
         </w:tc>
@@ -2738,7 +2738,7 @@
         </w:trPr>
         <w:tc>
           <w:tcPr>
-            <w:tcW w:w="2020" w:type="dxa"/>
+            <w:tcW w:w="1991" w:type="dxa"/>
             <w:tcMar>
               <w:top w:w="65" w:type="dxa"/>
               <w:left w:w="65" w:type="dxa"/>
@@ -2761,7 +2761,7 @@
         </w:tc>
         <w:tc>
           <w:tcPr>
-            <w:tcW w:w="1349" w:type="dxa"/>
+            <w:tcW w:w="1330" w:type="dxa"/>
             <w:tcMar>
               <w:top w:w="65" w:type="dxa"/>
               <w:left w:w="65" w:type="dxa"/>
@@ -2784,7 +2784,7 @@
         </w:tc>
         <w:tc>
           <w:tcPr>
-            <w:tcW w:w="2272" w:type="dxa"/>
+            <w:tcW w:w="2376" w:type="dxa"/>
             <w:tcMar>
               <w:top w:w="65" w:type="dxa"/>
               <w:left w:w="65" w:type="dxa"/>
@@ -2801,13 +2801,13 @@
               <w:rPr>
                 <w:sz w:val="21"/>
               </w:rPr>
-              <w:t>Chưa có artifacts full</w:t>
-            </w:r>
-          </w:p>
-        </w:tc>
-        <w:tc>
-          <w:tcPr>
-            <w:tcW w:w="1349" w:type="dxa"/>
+              <w:t>Full validation hoàn thành</w:t>
+            </w:r>
+          </w:p>
+        </w:tc>
+        <w:tc>
+          <w:tcPr>
+            <w:tcW w:w="1330" w:type="dxa"/>
             <w:tcMar>
               <w:top w:w="65" w:type="dxa"/>
               <w:left w:w="65" w:type="dxa"/>
@@ -2824,13 +2824,13 @@
               <w:rPr>
                 <w:sz w:val="21"/>
               </w:rPr>
-              <w:t>—</w:t>
-            </w:r>
-          </w:p>
-        </w:tc>
-        <w:tc>
-          <w:tcPr>
-            <w:tcW w:w="1349" w:type="dxa"/>
+              <w:t>0.4306</w:t>
+            </w:r>
+          </w:p>
+        </w:tc>
+        <w:tc>
+          <w:tcPr>
+            <w:tcW w:w="1330" w:type="dxa"/>
             <w:tcMar>
               <w:top w:w="65" w:type="dxa"/>
               <w:left w:w="65" w:type="dxa"/>
@@ -2847,13 +2847,13 @@
               <w:rPr>
                 <w:sz w:val="21"/>
               </w:rPr>
-              <w:t>—</w:t>
-            </w:r>
-          </w:p>
-        </w:tc>
-        <w:tc>
-          <w:tcPr>
-            <w:tcW w:w="1349" w:type="dxa"/>
+              <w:t>0.5792</w:t>
+            </w:r>
+          </w:p>
+        </w:tc>
+        <w:tc>
+          <w:tcPr>
+            <w:tcW w:w="1330" w:type="dxa"/>
             <w:tcMar>
               <w:top w:w="65" w:type="dxa"/>
               <w:left w:w="65" w:type="dxa"/>
@@ -2870,7 +2870,7 @@
               <w:rPr>
                 <w:sz w:val="21"/>
               </w:rPr>
-              <w:t>—</w:t>
+              <w:t>0.0300</w:t>
             </w:r>
           </w:p>
         </w:tc>
@@ -2882,7 +2882,7 @@
         </w:trPr>
         <w:tc>
           <w:tcPr>
-            <w:tcW w:w="2020" w:type="dxa"/>
+            <w:tcW w:w="1991" w:type="dxa"/>
             <w:tcMar>
               <w:top w:w="65" w:type="dxa"/>
               <w:left w:w="65" w:type="dxa"/>
@@ -2905,7 +2905,7 @@
         </w:tc>
         <w:tc>
           <w:tcPr>
-            <w:tcW w:w="1349" w:type="dxa"/>
+            <w:tcW w:w="1330" w:type="dxa"/>
             <w:tcMar>
               <w:top w:w="65" w:type="dxa"/>
               <w:left w:w="65" w:type="dxa"/>
@@ -2928,7 +2928,7 @@
         </w:tc>
         <w:tc>
           <w:tcPr>
-            <w:tcW w:w="2272" w:type="dxa"/>
+            <w:tcW w:w="2376" w:type="dxa"/>
             <w:tcMar>
               <w:top w:w="65" w:type="dxa"/>
               <w:left w:w="65" w:type="dxa"/>
@@ -2945,13 +2945,13 @@
               <w:rPr>
                 <w:sz w:val="21"/>
               </w:rPr>
-              <w:t>Chưa có artifacts full</w:t>
-            </w:r>
-          </w:p>
-        </w:tc>
-        <w:tc>
-          <w:tcPr>
-            <w:tcW w:w="1349" w:type="dxa"/>
+              <w:t>Full validation hoàn thành</w:t>
+            </w:r>
+          </w:p>
+        </w:tc>
+        <w:tc>
+          <w:tcPr>
+            <w:tcW w:w="1330" w:type="dxa"/>
             <w:tcMar>
               <w:top w:w="65" w:type="dxa"/>
               <w:left w:w="65" w:type="dxa"/>
@@ -2968,13 +2968,13 @@
               <w:rPr>
                 <w:sz w:val="21"/>
               </w:rPr>
-              <w:t>—</w:t>
-            </w:r>
-          </w:p>
-        </w:tc>
-        <w:tc>
-          <w:tcPr>
-            <w:tcW w:w="1349" w:type="dxa"/>
+              <w:t>0.4018</w:t>
+            </w:r>
+          </w:p>
+        </w:tc>
+        <w:tc>
+          <w:tcPr>
+            <w:tcW w:w="1330" w:type="dxa"/>
             <w:tcMar>
               <w:top w:w="65" w:type="dxa"/>
               <w:left w:w="65" w:type="dxa"/>
@@ -2991,13 +2991,13 @@
               <w:rPr>
                 <w:sz w:val="21"/>
               </w:rPr>
-              <w:t>—</w:t>
-            </w:r>
-          </w:p>
-        </w:tc>
-        <w:tc>
-          <w:tcPr>
-            <w:tcW w:w="1349" w:type="dxa"/>
+              <w:t>0.5668</w:t>
+            </w:r>
+          </w:p>
+        </w:tc>
+        <w:tc>
+          <w:tcPr>
+            <w:tcW w:w="1330" w:type="dxa"/>
             <w:tcMar>
               <w:top w:w="65" w:type="dxa"/>
               <w:left w:w="65" w:type="dxa"/>
@@ -3014,7 +3014,7 @@
               <w:rPr>
                 <w:sz w:val="21"/>
               </w:rPr>
-              <w:t>—</w:t>
+              <w:t>0.0304</w:t>
             </w:r>
           </w:p>
         </w:tc>
@@ -3026,7 +3026,7 @@
         </w:trPr>
         <w:tc>
           <w:tcPr>
-            <w:tcW w:w="2020" w:type="dxa"/>
+            <w:tcW w:w="1991" w:type="dxa"/>
             <w:tcMar>
               <w:top w:w="65" w:type="dxa"/>
               <w:left w:w="65" w:type="dxa"/>
@@ -3049,7 +3049,7 @@
         </w:tc>
         <w:tc>
           <w:tcPr>
-            <w:tcW w:w="1349" w:type="dxa"/>
+            <w:tcW w:w="1330" w:type="dxa"/>
             <w:tcMar>
               <w:top w:w="65" w:type="dxa"/>
               <w:left w:w="65" w:type="dxa"/>
@@ -3072,7 +3072,7 @@
         </w:tc>
         <w:tc>
           <w:tcPr>
-            <w:tcW w:w="2272" w:type="dxa"/>
+            <w:tcW w:w="2376" w:type="dxa"/>
             <w:tcMar>
               <w:top w:w="65" w:type="dxa"/>
               <w:left w:w="65" w:type="dxa"/>
@@ -3089,13 +3089,13 @@
               <w:rPr>
                 <w:sz w:val="21"/>
               </w:rPr>
-              <w:t>Chưa có artifacts full</w:t>
-            </w:r>
-          </w:p>
-        </w:tc>
-        <w:tc>
-          <w:tcPr>
-            <w:tcW w:w="1349" w:type="dxa"/>
+              <w:t>Full validation hoàn thành</w:t>
+            </w:r>
+          </w:p>
+        </w:tc>
+        <w:tc>
+          <w:tcPr>
+            <w:tcW w:w="1330" w:type="dxa"/>
             <w:tcMar>
               <w:top w:w="65" w:type="dxa"/>
               <w:left w:w="65" w:type="dxa"/>
@@ -3112,13 +3112,13 @@
               <w:rPr>
                 <w:sz w:val="21"/>
               </w:rPr>
-              <w:t>—</w:t>
-            </w:r>
-          </w:p>
-        </w:tc>
-        <w:tc>
-          <w:tcPr>
-            <w:tcW w:w="1349" w:type="dxa"/>
+              <w:t>0.4132</w:t>
+            </w:r>
+          </w:p>
+        </w:tc>
+        <w:tc>
+          <w:tcPr>
+            <w:tcW w:w="1330" w:type="dxa"/>
             <w:tcMar>
               <w:top w:w="65" w:type="dxa"/>
               <w:left w:w="65" w:type="dxa"/>
@@ -3135,13 +3135,13 @@
               <w:rPr>
                 <w:sz w:val="21"/>
               </w:rPr>
-              <w:t>—</w:t>
-            </w:r>
-          </w:p>
-        </w:tc>
-        <w:tc>
-          <w:tcPr>
-            <w:tcW w:w="1349" w:type="dxa"/>
+              <w:t>0.5739</w:t>
+            </w:r>
+          </w:p>
+        </w:tc>
+        <w:tc>
+          <w:tcPr>
+            <w:tcW w:w="1330" w:type="dxa"/>
             <w:tcMar>
               <w:top w:w="65" w:type="dxa"/>
               <w:left w:w="65" w:type="dxa"/>
@@ -3158,7 +3158,7 @@
               <w:rPr>
                 <w:sz w:val="21"/>
               </w:rPr>
-              <w:t>—</w:t>
+              <w:t>0.0300</w:t>
             </w:r>
           </w:p>
         </w:tc>
@@ -3170,7 +3170,7 @@
         </w:trPr>
         <w:tc>
           <w:tcPr>
-            <w:tcW w:w="2020" w:type="dxa"/>
+            <w:tcW w:w="1991" w:type="dxa"/>
             <w:tcMar>
               <w:top w:w="65" w:type="dxa"/>
               <w:left w:w="65" w:type="dxa"/>
@@ -3193,7 +3193,7 @@
         </w:tc>
         <w:tc>
           <w:tcPr>
-            <w:tcW w:w="1349" w:type="dxa"/>
+            <w:tcW w:w="1330" w:type="dxa"/>
             <w:tcMar>
               <w:top w:w="65" w:type="dxa"/>
               <w:left w:w="65" w:type="dxa"/>
@@ -3216,7 +3216,7 @@
         </w:tc>
         <w:tc>
           <w:tcPr>
-            <w:tcW w:w="2272" w:type="dxa"/>
+            <w:tcW w:w="2376" w:type="dxa"/>
             <w:tcMar>
               <w:top w:w="65" w:type="dxa"/>
               <w:left w:w="65" w:type="dxa"/>
@@ -3233,13 +3233,13 @@
               <w:rPr>
                 <w:sz w:val="21"/>
               </w:rPr>
-              <w:t>Chưa có artifacts full</w:t>
-            </w:r>
-          </w:p>
-        </w:tc>
-        <w:tc>
-          <w:tcPr>
-            <w:tcW w:w="1349" w:type="dxa"/>
+              <w:t>Full validation hoàn thành</w:t>
+            </w:r>
+          </w:p>
+        </w:tc>
+        <w:tc>
+          <w:tcPr>
+            <w:tcW w:w="1330" w:type="dxa"/>
             <w:tcMar>
               <w:top w:w="65" w:type="dxa"/>
               <w:left w:w="65" w:type="dxa"/>
@@ -3256,13 +3256,13 @@
               <w:rPr>
                 <w:sz w:val="21"/>
               </w:rPr>
-              <w:t>—</w:t>
-            </w:r>
-          </w:p>
-        </w:tc>
-        <w:tc>
-          <w:tcPr>
-            <w:tcW w:w="1349" w:type="dxa"/>
+              <w:t>0.4042</w:t>
+            </w:r>
+          </w:p>
+        </w:tc>
+        <w:tc>
+          <w:tcPr>
+            <w:tcW w:w="1330" w:type="dxa"/>
             <w:tcMar>
               <w:top w:w="65" w:type="dxa"/>
               <w:left w:w="65" w:type="dxa"/>
@@ -3279,13 +3279,13 @@
               <w:rPr>
                 <w:sz w:val="21"/>
               </w:rPr>
-              <w:t>—</w:t>
-            </w:r>
-          </w:p>
-        </w:tc>
-        <w:tc>
-          <w:tcPr>
-            <w:tcW w:w="1349" w:type="dxa"/>
+              <w:t>0.5728</w:t>
+            </w:r>
+          </w:p>
+        </w:tc>
+        <w:tc>
+          <w:tcPr>
+            <w:tcW w:w="1330" w:type="dxa"/>
             <w:tcMar>
               <w:top w:w="65" w:type="dxa"/>
               <w:left w:w="65" w:type="dxa"/>
@@ -3302,7 +3302,7 @@
               <w:rPr>
                 <w:sz w:val="21"/>
               </w:rPr>
-              <w:t>—</w:t>
+              <w:t>0.0300</w:t>
             </w:r>
           </w:p>
         </w:tc>
@@ -3322,10 +3322,10 @@
         <w:tblLook w:val="04A0" w:firstRow="1" w:lastRow="0" w:firstColumn="1" w:lastColumn="0" w:noHBand="0" w:noVBand="1"/>
       </w:tblPr>
       <w:tblGrid>
-        <w:gridCol w:w="2103"/>
-        <w:gridCol w:w="1490"/>
-        <w:gridCol w:w="3518"/>
-        <w:gridCol w:w="2578"/>
+        <w:gridCol w:w="1788"/>
+        <w:gridCol w:w="1266"/>
+        <w:gridCol w:w="3317"/>
+        <w:gridCol w:w="3317"/>
       </w:tblGrid>
       <w:tr>
         <w:trPr>
@@ -3335,7 +3335,7 @@
         </w:trPr>
         <w:tc>
           <w:tcPr>
-            <w:tcW w:w="2103" w:type="dxa"/>
+            <w:tcW w:w="1788" w:type="dxa"/>
             <w:shd w:val="clear" w:color="auto" w:fill="E6EDF3"/>
             <w:tcMar>
               <w:top w:w="65" w:type="dxa"/>
@@ -3361,7 +3361,7 @@
         </w:tc>
         <w:tc>
           <w:tcPr>
-            <w:tcW w:w="1490" w:type="dxa"/>
+            <w:tcW w:w="1266" w:type="dxa"/>
             <w:shd w:val="clear" w:color="auto" w:fill="E6EDF3"/>
             <w:tcMar>
               <w:top w:w="65" w:type="dxa"/>
@@ -3387,7 +3387,7 @@
         </w:tc>
         <w:tc>
           <w:tcPr>
-            <w:tcW w:w="3518" w:type="dxa"/>
+            <w:tcW w:w="3317" w:type="dxa"/>
             <w:shd w:val="clear" w:color="auto" w:fill="E6EDF3"/>
             <w:tcMar>
               <w:top w:w="65" w:type="dxa"/>
@@ -3413,7 +3413,7 @@
         </w:tc>
         <w:tc>
           <w:tcPr>
-            <w:tcW w:w="2578" w:type="dxa"/>
+            <w:tcW w:w="3317" w:type="dxa"/>
             <w:shd w:val="clear" w:color="auto" w:fill="E6EDF3"/>
             <w:tcMar>
               <w:top w:w="65" w:type="dxa"/>
@@ -3445,7 +3445,7 @@
         </w:trPr>
         <w:tc>
           <w:tcPr>
-            <w:tcW w:w="2103" w:type="dxa"/>
+            <w:tcW w:w="1788" w:type="dxa"/>
             <w:tcMar>
               <w:top w:w="65" w:type="dxa"/>
               <w:left w:w="65" w:type="dxa"/>
@@ -3468,7 +3468,7 @@
         </w:tc>
         <w:tc>
           <w:tcPr>
-            <w:tcW w:w="1490" w:type="dxa"/>
+            <w:tcW w:w="1266" w:type="dxa"/>
             <w:tcMar>
               <w:top w:w="65" w:type="dxa"/>
               <w:left w:w="65" w:type="dxa"/>
@@ -3491,7 +3491,7 @@
         </w:tc>
         <w:tc>
           <w:tcPr>
-            <w:tcW w:w="3518" w:type="dxa"/>
+            <w:tcW w:w="3317" w:type="dxa"/>
             <w:tcMar>
               <w:top w:w="65" w:type="dxa"/>
               <w:left w:w="65" w:type="dxa"/>
@@ -3508,13 +3508,19 @@
               <w:rPr>
                 <w:sz w:val="21"/>
               </w:rPr>
-              <w:t>NVIDIA GeForce RTX 5060 Laptop GPU; Python 3.13.9; torch 2.13.0+cu130; Transformers 4.57.6</w:t>
-            </w:r>
-          </w:p>
-        </w:tc>
-        <w:tc>
-          <w:tcPr>
-            <w:tcW w:w="2578" w:type="dxa"/>
+              <w:t xml:space="preserve">NVIDIA GeForce RTX 5060 Laptop GPU; Python 3.13.9; torch </w:t>
+            </w:r>
+            <w:r>
+              <w:rPr>
+                <w:sz w:val="21"/>
+              </w:rPr>
+              <w:t>2.13.0+cu130; Transformers 4.57.6</w:t>
+            </w:r>
+          </w:p>
+        </w:tc>
+        <w:tc>
+          <w:tcPr>
+            <w:tcW w:w="3317" w:type="dxa"/>
             <w:tcMar>
               <w:top w:w="65" w:type="dxa"/>
               <w:left w:w="65" w:type="dxa"/>
@@ -3531,13 +3537,7 @@
               <w:rPr>
                 <w:sz w:val="21"/>
               </w:rPr>
-              <w:t xml:space="preserve">lr=5e-05; epochs=4; batch=16; accum=1; max_length=128; </w:t>
-            </w:r>
-            <w:r>
-              <w:rPr>
-                <w:sz w:val="21"/>
-              </w:rPr>
-              <w:t>dynamic_batch_trim</w:t>
+              <w:t>lr=5e-05; epochs=4; batch=16; accum=1; max_length=128; dynamic_batch_trim</w:t>
             </w:r>
           </w:p>
         </w:tc>
@@ -3549,7 +3549,7 @@
         </w:trPr>
         <w:tc>
           <w:tcPr>
-            <w:tcW w:w="2103" w:type="dxa"/>
+            <w:tcW w:w="1788" w:type="dxa"/>
             <w:tcMar>
               <w:top w:w="65" w:type="dxa"/>
               <w:left w:w="65" w:type="dxa"/>
@@ -3572,7 +3572,7 @@
         </w:tc>
         <w:tc>
           <w:tcPr>
-            <w:tcW w:w="1490" w:type="dxa"/>
+            <w:tcW w:w="1266" w:type="dxa"/>
             <w:tcMar>
               <w:top w:w="65" w:type="dxa"/>
               <w:left w:w="65" w:type="dxa"/>
@@ -3595,7 +3595,7 @@
         </w:tc>
         <w:tc>
           <w:tcPr>
-            <w:tcW w:w="3518" w:type="dxa"/>
+            <w:tcW w:w="3317" w:type="dxa"/>
             <w:tcMar>
               <w:top w:w="65" w:type="dxa"/>
               <w:left w:w="65" w:type="dxa"/>
@@ -3612,13 +3612,13 @@
               <w:rPr>
                 <w:sz w:val="21"/>
               </w:rPr>
-              <w:t>Chưa có metadata full</w:t>
-            </w:r>
-          </w:p>
-        </w:tc>
-        <w:tc>
-          <w:tcPr>
-            <w:tcW w:w="2578" w:type="dxa"/>
+              <w:t>NVIDIA GeForce RTX 5060 Laptop GPU; Python 3.13.9; torch 2.13.0+cu130; Transformers 4.57.6</w:t>
+            </w:r>
+          </w:p>
+        </w:tc>
+        <w:tc>
+          <w:tcPr>
+            <w:tcW w:w="3317" w:type="dxa"/>
             <w:tcMar>
               <w:top w:w="65" w:type="dxa"/>
               <w:left w:w="65" w:type="dxa"/>
@@ -3635,7 +3635,13 @@
               <w:rPr>
                 <w:sz w:val="21"/>
               </w:rPr>
-              <w:t>—</w:t>
+              <w:t xml:space="preserve">lr=2e-05; epochs=3; </w:t>
+            </w:r>
+            <w:r>
+              <w:rPr>
+                <w:sz w:val="21"/>
+              </w:rPr>
+              <w:t>batch=16; accum=1; max_length=128; dynamic_batch_trim</w:t>
             </w:r>
           </w:p>
         </w:tc>
@@ -3647,7 +3653,7 @@
         </w:trPr>
         <w:tc>
           <w:tcPr>
-            <w:tcW w:w="2103" w:type="dxa"/>
+            <w:tcW w:w="1788" w:type="dxa"/>
             <w:tcMar>
               <w:top w:w="65" w:type="dxa"/>
               <w:left w:w="65" w:type="dxa"/>
@@ -3670,7 +3676,7 @@
         </w:tc>
         <w:tc>
           <w:tcPr>
-            <w:tcW w:w="1490" w:type="dxa"/>
+            <w:tcW w:w="1266" w:type="dxa"/>
             <w:tcMar>
               <w:top w:w="65" w:type="dxa"/>
               <w:left w:w="65" w:type="dxa"/>
@@ -3693,7 +3699,7 @@
         </w:tc>
         <w:tc>
           <w:tcPr>
-            <w:tcW w:w="3518" w:type="dxa"/>
+            <w:tcW w:w="3317" w:type="dxa"/>
             <w:tcMar>
               <w:top w:w="65" w:type="dxa"/>
               <w:left w:w="65" w:type="dxa"/>
@@ -3710,13 +3716,13 @@
               <w:rPr>
                 <w:sz w:val="21"/>
               </w:rPr>
-              <w:t>Chưa có metadata full</w:t>
-            </w:r>
-          </w:p>
-        </w:tc>
-        <w:tc>
-          <w:tcPr>
-            <w:tcW w:w="2578" w:type="dxa"/>
+              <w:t>NVIDIA GeForce RTX 5060 Laptop GPU; Python 3.13.9; torch 2.13.0+cu130; Transformers 4.57.6</w:t>
+            </w:r>
+          </w:p>
+        </w:tc>
+        <w:tc>
+          <w:tcPr>
+            <w:tcW w:w="3317" w:type="dxa"/>
             <w:tcMar>
               <w:top w:w="65" w:type="dxa"/>
               <w:left w:w="65" w:type="dxa"/>
@@ -3733,7 +3739,7 @@
               <w:rPr>
                 <w:sz w:val="21"/>
               </w:rPr>
-              <w:t>—</w:t>
+              <w:t>lr=2e-05; epochs=3; batch=16; accum=1; max_length=128; dynamic_batch_trim</w:t>
             </w:r>
           </w:p>
         </w:tc>
@@ -3749,10 +3755,7 @@
         <w:jc w:val="both"/>
       </w:pPr>
       <w:r>
-        <w:t xml:space="preserve">BERT cased theo lựa chọn kho GoEmotions; RoBERTa và DistilBERT có tokenizer/head riêng. Mỗi kiến trúc cần ba seed cùng cấu </w:t>
-      </w:r>
-      <w:r>
-        <w:t>hình. Mốc mean±std chỉ tổng hợp khi đủ run; không tự báo std=0 với một seed. Tài liệu kiến trúc giải thích nền tảng C1/C2/C3 [6], [7], [8].</w:t>
+        <w:t>BERT cased theo lựa chọn kho GoEmotions; RoBERTa và DistilBERT có tokenizer/head riêng. Mỗi kiến trúc cần ba seed cùng cấu hình. Mốc mean±std chỉ tổng hợp khi đủ run; không tự báo std=0 với một seed. Tài liệu kiến trúc giải thích nền tảng C1/C2/C3 [6], [7], [8].</w:t>
       </w:r>
     </w:p>
     <w:p>
@@ -3772,10 +3775,10 @@
         <w:tblLook w:val="04A0" w:firstRow="1" w:lastRow="0" w:firstColumn="1" w:lastColumn="0" w:noHBand="0" w:noVBand="1"/>
       </w:tblPr>
       <w:tblGrid>
-        <w:gridCol w:w="1491"/>
-        <w:gridCol w:w="3046"/>
-        <w:gridCol w:w="2966"/>
-        <w:gridCol w:w="2185"/>
+        <w:gridCol w:w="1496"/>
+        <w:gridCol w:w="3054"/>
+        <w:gridCol w:w="2947"/>
+        <w:gridCol w:w="2191"/>
       </w:tblGrid>
       <w:tr>
         <w:trPr>
@@ -3785,7 +3788,7 @@
         </w:trPr>
         <w:tc>
           <w:tcPr>
-            <w:tcW w:w="1491" w:type="dxa"/>
+            <w:tcW w:w="1496" w:type="dxa"/>
             <w:shd w:val="clear" w:color="auto" w:fill="E6EDF3"/>
             <w:tcMar>
               <w:top w:w="65" w:type="dxa"/>
@@ -3811,7 +3814,7 @@
         </w:tc>
         <w:tc>
           <w:tcPr>
-            <w:tcW w:w="3046" w:type="dxa"/>
+            <w:tcW w:w="3054" w:type="dxa"/>
             <w:shd w:val="clear" w:color="auto" w:fill="E6EDF3"/>
             <w:tcMar>
               <w:top w:w="65" w:type="dxa"/>
@@ -3837,7 +3840,7 @@
         </w:tc>
         <w:tc>
           <w:tcPr>
-            <w:tcW w:w="2966" w:type="dxa"/>
+            <w:tcW w:w="2947" w:type="dxa"/>
             <w:shd w:val="clear" w:color="auto" w:fill="E6EDF3"/>
             <w:tcMar>
               <w:top w:w="65" w:type="dxa"/>
@@ -3863,7 +3866,7 @@
         </w:tc>
         <w:tc>
           <w:tcPr>
-            <w:tcW w:w="2185" w:type="dxa"/>
+            <w:tcW w:w="2191" w:type="dxa"/>
             <w:shd w:val="clear" w:color="auto" w:fill="E6EDF3"/>
             <w:tcMar>
               <w:top w:w="65" w:type="dxa"/>
@@ -3895,7 +3898,7 @@
         </w:trPr>
         <w:tc>
           <w:tcPr>
-            <w:tcW w:w="1491" w:type="dxa"/>
+            <w:tcW w:w="1496" w:type="dxa"/>
             <w:tcMar>
               <w:top w:w="65" w:type="dxa"/>
               <w:left w:w="65" w:type="dxa"/>
@@ -3918,7 +3921,7 @@
         </w:tc>
         <w:tc>
           <w:tcPr>
-            <w:tcW w:w="3046" w:type="dxa"/>
+            <w:tcW w:w="3054" w:type="dxa"/>
             <w:tcMar>
               <w:top w:w="65" w:type="dxa"/>
               <w:left w:w="65" w:type="dxa"/>
@@ -3935,19 +3938,13 @@
               <w:rPr>
                 <w:sz w:val="21"/>
               </w:rPr>
-              <w:t xml:space="preserve">A; </w:t>
-            </w:r>
-            <w:r>
-              <w:rPr>
-                <w:sz w:val="21"/>
-              </w:rPr>
-              <w:t>điều phối B; data/metrics và bảng nâng cao</w:t>
-            </w:r>
-          </w:p>
-        </w:tc>
-        <w:tc>
-          <w:tcPr>
-            <w:tcW w:w="2966" w:type="dxa"/>
+              <w:t>A; điều phối B; data/metrics và bảng nâng cao</w:t>
+            </w:r>
+          </w:p>
+        </w:tc>
+        <w:tc>
+          <w:tcPr>
+            <w:tcW w:w="2947" w:type="dxa"/>
             <w:tcMar>
               <w:top w:w="65" w:type="dxa"/>
               <w:left w:w="65" w:type="dxa"/>
@@ -3964,13 +3961,13 @@
               <w:rPr>
                 <w:sz w:val="21"/>
               </w:rPr>
-              <w:t>A full validation; B chưa đủ full</w:t>
-            </w:r>
-          </w:p>
-        </w:tc>
-        <w:tc>
-          <w:tcPr>
-            <w:tcW w:w="2185" w:type="dxa"/>
+              <w:t>A full validation; B full đã có</w:t>
+            </w:r>
+          </w:p>
+        </w:tc>
+        <w:tc>
+          <w:tcPr>
+            <w:tcW w:w="2191" w:type="dxa"/>
             <w:tcMar>
               <w:top w:w="65" w:type="dxa"/>
               <w:left w:w="65" w:type="dxa"/>
@@ -3999,7 +3996,7 @@
         </w:trPr>
         <w:tc>
           <w:tcPr>
-            <w:tcW w:w="1491" w:type="dxa"/>
+            <w:tcW w:w="1496" w:type="dxa"/>
             <w:tcMar>
               <w:top w:w="65" w:type="dxa"/>
               <w:left w:w="65" w:type="dxa"/>
@@ -4022,7 +4019,7 @@
         </w:tc>
         <w:tc>
           <w:tcPr>
-            <w:tcW w:w="3046" w:type="dxa"/>
+            <w:tcW w:w="3054" w:type="dxa"/>
             <w:tcMar>
               <w:top w:w="65" w:type="dxa"/>
               <w:left w:w="65" w:type="dxa"/>
@@ -4039,13 +4036,19 @@
               <w:rPr>
                 <w:sz w:val="21"/>
               </w:rPr>
-              <w:t>C1 BERT; phần đầu/tổng hợp báo cáo</w:t>
-            </w:r>
-          </w:p>
-        </w:tc>
-        <w:tc>
-          <w:tcPr>
-            <w:tcW w:w="2966" w:type="dxa"/>
+              <w:t xml:space="preserve">C1 BERT; phần </w:t>
+            </w:r>
+            <w:r>
+              <w:rPr>
+                <w:sz w:val="21"/>
+              </w:rPr>
+              <w:t>đầu/tổng hợp báo cáo</w:t>
+            </w:r>
+          </w:p>
+        </w:tc>
+        <w:tc>
+          <w:tcPr>
+            <w:tcW w:w="2947" w:type="dxa"/>
             <w:tcMar>
               <w:top w:w="65" w:type="dxa"/>
               <w:left w:w="65" w:type="dxa"/>
@@ -4062,13 +4065,13 @@
               <w:rPr>
                 <w:sz w:val="21"/>
               </w:rPr>
-              <w:t>C1 1/3 seed full; xem bảng run</w:t>
-            </w:r>
-          </w:p>
-        </w:tc>
-        <w:tc>
-          <w:tcPr>
-            <w:tcW w:w="2185" w:type="dxa"/>
+              <w:t>C1 3/3 seed full; xem bảng run</w:t>
+            </w:r>
+          </w:p>
+        </w:tc>
+        <w:tc>
+          <w:tcPr>
+            <w:tcW w:w="2191" w:type="dxa"/>
             <w:tcMar>
               <w:top w:w="65" w:type="dxa"/>
               <w:left w:w="65" w:type="dxa"/>
@@ -4097,7 +4100,7 @@
         </w:trPr>
         <w:tc>
           <w:tcPr>
-            <w:tcW w:w="1491" w:type="dxa"/>
+            <w:tcW w:w="1496" w:type="dxa"/>
             <w:tcMar>
               <w:top w:w="65" w:type="dxa"/>
               <w:left w:w="65" w:type="dxa"/>
@@ -4120,7 +4123,7 @@
         </w:tc>
         <w:tc>
           <w:tcPr>
-            <w:tcW w:w="3046" w:type="dxa"/>
+            <w:tcW w:w="3054" w:type="dxa"/>
             <w:tcMar>
               <w:top w:w="65" w:type="dxa"/>
               <w:left w:w="65" w:type="dxa"/>
@@ -4143,7 +4146,7 @@
         </w:tc>
         <w:tc>
           <w:tcPr>
-            <w:tcW w:w="2966" w:type="dxa"/>
+            <w:tcW w:w="2947" w:type="dxa"/>
             <w:tcMar>
               <w:top w:w="65" w:type="dxa"/>
               <w:left w:w="65" w:type="dxa"/>
@@ -4160,19 +4163,13 @@
               <w:rPr>
                 <w:sz w:val="21"/>
               </w:rPr>
-              <w:t xml:space="preserve">C2 0/3 seed </w:t>
-            </w:r>
-            <w:r>
-              <w:rPr>
-                <w:sz w:val="21"/>
-              </w:rPr>
-              <w:t>full; xem bảng run</w:t>
-            </w:r>
-          </w:p>
-        </w:tc>
-        <w:tc>
-          <w:tcPr>
-            <w:tcW w:w="2185" w:type="dxa"/>
+              <w:t>C2 3/3 seed full; xem bảng run</w:t>
+            </w:r>
+          </w:p>
+        </w:tc>
+        <w:tc>
+          <w:tcPr>
+            <w:tcW w:w="2191" w:type="dxa"/>
             <w:tcMar>
               <w:top w:w="65" w:type="dxa"/>
               <w:left w:w="65" w:type="dxa"/>
@@ -4201,7 +4198,7 @@
         </w:trPr>
         <w:tc>
           <w:tcPr>
-            <w:tcW w:w="1491" w:type="dxa"/>
+            <w:tcW w:w="1496" w:type="dxa"/>
             <w:tcMar>
               <w:top w:w="65" w:type="dxa"/>
               <w:left w:w="65" w:type="dxa"/>
@@ -4225,7 +4222,7 @@
         </w:tc>
         <w:tc>
           <w:tcPr>
-            <w:tcW w:w="3046" w:type="dxa"/>
+            <w:tcW w:w="3054" w:type="dxa"/>
             <w:tcMar>
               <w:top w:w="65" w:type="dxa"/>
               <w:left w:w="65" w:type="dxa"/>
@@ -4248,7 +4245,7 @@
         </w:tc>
         <w:tc>
           <w:tcPr>
-            <w:tcW w:w="2966" w:type="dxa"/>
+            <w:tcW w:w="2947" w:type="dxa"/>
             <w:tcMar>
               <w:top w:w="65" w:type="dxa"/>
               <w:left w:w="65" w:type="dxa"/>
@@ -4265,13 +4262,13 @@
               <w:rPr>
                 <w:sz w:val="21"/>
               </w:rPr>
-              <w:t>C3 0/3 seed full; demo theo hồ sơ</w:t>
-            </w:r>
-          </w:p>
-        </w:tc>
-        <w:tc>
-          <w:tcPr>
-            <w:tcW w:w="2185" w:type="dxa"/>
+              <w:t>C3 3/3 seed full; demo theo hồ sơ</w:t>
+            </w:r>
+          </w:p>
+        </w:tc>
+        <w:tc>
+          <w:tcPr>
+            <w:tcW w:w="2191" w:type="dxa"/>
             <w:tcMar>
               <w:top w:w="65" w:type="dxa"/>
               <w:left w:w="65" w:type="dxa"/>
@@ -4320,7 +4317,10 @@
         <w:pStyle w:val="ListBullet"/>
       </w:pPr>
       <w:r>
-        <w:t>Hoàn tất B full và ba C đủ seed; giữ logs/checkpoints/scores/config.</w:t>
+        <w:t xml:space="preserve">Đã đủ B </w:t>
+      </w:r>
+      <w:r>
+        <w:t>full và 9/9 run C; duy trì logs/checkpoints/scores/config khi bàn giao.</w:t>
       </w:r>
     </w:p>
     <w:p>
@@ -4328,10 +4328,7 @@
         <w:pStyle w:val="ListBullet"/>
       </w:pPr>
       <w:r>
-        <w:t xml:space="preserve">Dùng validation để khóa kiến trúc/seed/ngưỡng trước test; </w:t>
-      </w:r>
-      <w:r>
-        <w:t>tránh tuned-val bị diễn giải thành test.</w:t>
+        <w:t>Đã khóa lựa chọn/ngưỡng trên validation và có test; không chọn lại bằng test.</w:t>
       </w:r>
     </w:p>
     <w:p>
@@ -4339,7 +4336,7 @@
         <w:pStyle w:val="ListBullet"/>
       </w:pPr>
       <w:r>
-        <w:t>Đối chiếu ít nhất ba nhóm lỗi cùng ID C1/C2/C3; dựng demo từ C được chọn.</w:t>
+        <w:t>Đã có ba case đối chiếu và hồ sơ demo; nhóm cần tự đọc, diễn giải và kiểm khi chuyển máy.</w:t>
       </w:r>
     </w:p>
     <w:p>
@@ -4394,7 +4391,7 @@
         <w:rPr>
           <w:rFonts w:ascii="Consolas" w:eastAsia="Consolas" w:hAnsi="Consolas" w:cs="Consolas"/>
         </w:rPr>
-        <w:t>29dfd39ae78ef014097a62c93598b9c15d2131b0f4bd7c912422bdfa59397a4b</w:t>
+        <w:t>2c73aa31fad9df0a8b0b46bedbb3c69c1316fa4e225f32529811e80ccd2e09b6</w:t>
       </w:r>
       <w:r>
         <w:t>. Script này chỉ đọc artifacts, không tự chạy GPU, không xác nhận đã nộp cô. Chạy lại sau khi cập nhật summary/runs để làm mới bản tiến độ.</w:t>
@@ -5154,31 +5151,31 @@
       </w:rPr>
     </w:lvl>
   </w:abstractNum>
-  <w:num w:numId="1" w16cid:durableId="1956867729">
+  <w:num w:numId="1" w16cid:durableId="645545314">
     <w:abstractNumId w:val="8"/>
   </w:num>
-  <w:num w:numId="2" w16cid:durableId="1978217110">
+  <w:num w:numId="2" w16cid:durableId="81729160">
     <w:abstractNumId w:val="6"/>
   </w:num>
-  <w:num w:numId="3" w16cid:durableId="945230617">
+  <w:num w:numId="3" w16cid:durableId="1031108112">
     <w:abstractNumId w:val="5"/>
   </w:num>
-  <w:num w:numId="4" w16cid:durableId="1795824432">
+  <w:num w:numId="4" w16cid:durableId="54939908">
     <w:abstractNumId w:val="4"/>
   </w:num>
-  <w:num w:numId="5" w16cid:durableId="381753140">
+  <w:num w:numId="5" w16cid:durableId="326984225">
     <w:abstractNumId w:val="7"/>
   </w:num>
-  <w:num w:numId="6" w16cid:durableId="1854033744">
+  <w:num w:numId="6" w16cid:durableId="648945094">
     <w:abstractNumId w:val="3"/>
   </w:num>
-  <w:num w:numId="7" w16cid:durableId="1857428391">
+  <w:num w:numId="7" w16cid:durableId="354424732">
     <w:abstractNumId w:val="2"/>
   </w:num>
-  <w:num w:numId="8" w16cid:durableId="1257399343">
+  <w:num w:numId="8" w16cid:durableId="1981769612">
     <w:abstractNumId w:val="1"/>
   </w:num>
-  <w:num w:numId="9" w16cid:durableId="1352030377">
+  <w:num w:numId="9" w16cid:durableId="1777216140">
     <w:abstractNumId w:val="0"/>
   </w:num>
 </w:numbering>

</xml_diff>